<commit_message>
Complete SentinelOps implementation: security gates, evidence tokens, policy kernel, audit chain, and live evals
</commit_message>
<xml_diff>
--- a/INFO.docx
+++ b/INFO.docx
@@ -148,7 +148,7 @@
     <w:p>
       <w:r>
         <w:pict w14:anchorId="0D54B400">
-          <v:rect id="_x0000_i1139" style="width:0;height:1.5pt" o:hralign="center" o:hrstd="t" o:hr="t" fillcolor="#a0a0a0" stroked="f"/>
+          <v:rect id="_x0000_i1025" style="width:0;height:1.5pt" o:hralign="center" o:hrstd="t" o:hr="t" fillcolor="#a0a0a0" stroked="f"/>
         </w:pict>
       </w:r>
     </w:p>
@@ -352,7 +352,7 @@
     <w:p>
       <w:r>
         <w:pict w14:anchorId="058A16BB">
-          <v:rect id="_x0000_i1140" style="width:0;height:1.5pt" o:hralign="center" o:hrstd="t" o:hr="t" fillcolor="#a0a0a0" stroked="f"/>
+          <v:rect id="_x0000_i1026" style="width:0;height:1.5pt" o:hralign="center" o:hrstd="t" o:hr="t" fillcolor="#a0a0a0" stroked="f"/>
         </w:pict>
       </w:r>
     </w:p>
@@ -590,7 +590,7 @@
     <w:p>
       <w:r>
         <w:pict w14:anchorId="1D96B64A">
-          <v:rect id="_x0000_i1141" style="width:0;height:1.5pt" o:hralign="center" o:hrstd="t" o:hr="t" fillcolor="#a0a0a0" stroked="f"/>
+          <v:rect id="_x0000_i1027" style="width:0;height:1.5pt" o:hralign="center" o:hrstd="t" o:hr="t" fillcolor="#a0a0a0" stroked="f"/>
         </w:pict>
       </w:r>
     </w:p>
@@ -819,7 +819,7 @@
     <w:p>
       <w:r>
         <w:pict w14:anchorId="39DBEAC2">
-          <v:rect id="_x0000_i1142" style="width:0;height:1.5pt" o:hralign="center" o:hrstd="t" o:hr="t" fillcolor="#a0a0a0" stroked="f"/>
+          <v:rect id="_x0000_i1028" style="width:0;height:1.5pt" o:hralign="center" o:hrstd="t" o:hr="t" fillcolor="#a0a0a0" stroked="f"/>
         </w:pict>
       </w:r>
     </w:p>
@@ -1062,7 +1062,7 @@
     <w:p>
       <w:r>
         <w:pict w14:anchorId="44C9DEF5">
-          <v:rect id="_x0000_i1143" style="width:0;height:1.5pt" o:hralign="center" o:hrstd="t" o:hr="t" fillcolor="#a0a0a0" stroked="f"/>
+          <v:rect id="_x0000_i1029" style="width:0;height:1.5pt" o:hralign="center" o:hrstd="t" o:hr="t" fillcolor="#a0a0a0" stroked="f"/>
         </w:pict>
       </w:r>
     </w:p>
@@ -1767,7 +1767,7 @@
     <w:p>
       <w:r>
         <w:pict w14:anchorId="0F7B259D">
-          <v:rect id="_x0000_i1144" style="width:0;height:1.5pt" o:hralign="center" o:hrstd="t" o:hr="t" fillcolor="#a0a0a0" stroked="f"/>
+          <v:rect id="_x0000_i1030" style="width:0;height:1.5pt" o:hralign="center" o:hrstd="t" o:hr="t" fillcolor="#a0a0a0" stroked="f"/>
         </w:pict>
       </w:r>
     </w:p>
@@ -2023,7 +2023,7 @@
     <w:p>
       <w:r>
         <w:pict w14:anchorId="025EABE4">
-          <v:rect id="_x0000_i1145" style="width:0;height:1.5pt" o:hralign="center" o:hrstd="t" o:hr="t" fillcolor="#a0a0a0" stroked="f"/>
+          <v:rect id="_x0000_i1031" style="width:0;height:1.5pt" o:hralign="center" o:hrstd="t" o:hr="t" fillcolor="#a0a0a0" stroked="f"/>
         </w:pict>
       </w:r>
     </w:p>
@@ -2341,7 +2341,7 @@
     <w:p>
       <w:r>
         <w:pict w14:anchorId="04F4F19E">
-          <v:rect id="_x0000_i1146" style="width:0;height:1.5pt" o:hralign="center" o:hrstd="t" o:hr="t" fillcolor="#a0a0a0" stroked="f"/>
+          <v:rect id="_x0000_i1032" style="width:0;height:1.5pt" o:hralign="center" o:hrstd="t" o:hr="t" fillcolor="#a0a0a0" stroked="f"/>
         </w:pict>
       </w:r>
     </w:p>
@@ -2559,7 +2559,7 @@
     <w:p>
       <w:r>
         <w:pict w14:anchorId="43E5FF2F">
-          <v:rect id="_x0000_i1147" style="width:0;height:1.5pt" o:hralign="center" o:hrstd="t" o:hr="t" fillcolor="#a0a0a0" stroked="f"/>
+          <v:rect id="_x0000_i1033" style="width:0;height:1.5pt" o:hralign="center" o:hrstd="t" o:hr="t" fillcolor="#a0a0a0" stroked="f"/>
         </w:pict>
       </w:r>
     </w:p>
@@ -2860,7 +2860,7 @@
     <w:p>
       <w:r>
         <w:pict w14:anchorId="697B952A">
-          <v:rect id="_x0000_i1148" style="width:0;height:1.5pt" o:hralign="center" o:hrstd="t" o:hr="t" fillcolor="#a0a0a0" stroked="f"/>
+          <v:rect id="_x0000_i1034" style="width:0;height:1.5pt" o:hralign="center" o:hrstd="t" o:hr="t" fillcolor="#a0a0a0" stroked="f"/>
         </w:pict>
       </w:r>
     </w:p>
@@ -3244,7 +3244,7 @@
     <w:p>
       <w:r>
         <w:pict w14:anchorId="45165AC7">
-          <v:rect id="_x0000_i1149" style="width:0;height:1.5pt" o:hralign="center" o:hrstd="t" o:hr="t" fillcolor="#a0a0a0" stroked="f"/>
+          <v:rect id="_x0000_i1035" style="width:0;height:1.5pt" o:hralign="center" o:hrstd="t" o:hr="t" fillcolor="#a0a0a0" stroked="f"/>
         </w:pict>
       </w:r>
     </w:p>
@@ -3757,7 +3757,7 @@
     <w:p>
       <w:r>
         <w:pict w14:anchorId="05A55B10">
-          <v:rect id="_x0000_i1150" style="width:0;height:1.5pt" o:hralign="center" o:hrstd="t" o:hr="t" fillcolor="#a0a0a0" stroked="f"/>
+          <v:rect id="_x0000_i1036" style="width:0;height:1.5pt" o:hralign="center" o:hrstd="t" o:hr="t" fillcolor="#a0a0a0" stroked="f"/>
         </w:pict>
       </w:r>
     </w:p>
@@ -4314,7 +4314,7 @@
     <w:p>
       <w:r>
         <w:pict w14:anchorId="33A33554">
-          <v:rect id="_x0000_i1151" style="width:0;height:1.5pt" o:hralign="center" o:hrstd="t" o:hr="t" fillcolor="#a0a0a0" stroked="f"/>
+          <v:rect id="_x0000_i1037" style="width:0;height:1.5pt" o:hralign="center" o:hrstd="t" o:hr="t" fillcolor="#a0a0a0" stroked="f"/>
         </w:pict>
       </w:r>
     </w:p>
@@ -4606,7 +4606,7 @@
     <w:p>
       <w:r>
         <w:pict w14:anchorId="17419A0E">
-          <v:rect id="_x0000_i1152" style="width:0;height:1.5pt" o:hralign="center" o:hrstd="t" o:hr="t" fillcolor="#a0a0a0" stroked="f"/>
+          <v:rect id="_x0000_i1038" style="width:0;height:1.5pt" o:hralign="center" o:hrstd="t" o:hr="t" fillcolor="#a0a0a0" stroked="f"/>
         </w:pict>
       </w:r>
     </w:p>
@@ -5466,7 +5466,7 @@
     <w:p>
       <w:r>
         <w:pict w14:anchorId="4ABFC9F3">
-          <v:rect id="_x0000_i1153" style="width:0;height:1.5pt" o:hralign="center" o:hrstd="t" o:hr="t" fillcolor="#a0a0a0" stroked="f"/>
+          <v:rect id="_x0000_i1039" style="width:0;height:1.5pt" o:hralign="center" o:hrstd="t" o:hr="t" fillcolor="#a0a0a0" stroked="f"/>
         </w:pict>
       </w:r>
     </w:p>
@@ -5839,7 +5839,7 @@
     <w:p>
       <w:r>
         <w:pict w14:anchorId="3AB35854">
-          <v:rect id="_x0000_i1154" style="width:0;height:1.5pt" o:hralign="center" o:hrstd="t" o:hr="t" fillcolor="#a0a0a0" stroked="f"/>
+          <v:rect id="_x0000_i1040" style="width:0;height:1.5pt" o:hralign="center" o:hrstd="t" o:hr="t" fillcolor="#a0a0a0" stroked="f"/>
         </w:pict>
       </w:r>
     </w:p>
@@ -6072,7 +6072,7 @@
     <w:p>
       <w:r>
         <w:pict w14:anchorId="0D505B52">
-          <v:rect id="_x0000_i1155" style="width:0;height:1.5pt" o:hralign="center" o:hrstd="t" o:hr="t" fillcolor="#a0a0a0" stroked="f"/>
+          <v:rect id="_x0000_i1041" style="width:0;height:1.5pt" o:hralign="center" o:hrstd="t" o:hr="t" fillcolor="#a0a0a0" stroked="f"/>
         </w:pict>
       </w:r>
     </w:p>
@@ -6464,7 +6464,7 @@
     <w:p>
       <w:r>
         <w:pict w14:anchorId="5ECC133B">
-          <v:rect id="_x0000_i1156" style="width:0;height:1.5pt" o:hralign="center" o:hrstd="t" o:hr="t" fillcolor="#a0a0a0" stroked="f"/>
+          <v:rect id="_x0000_i1042" style="width:0;height:1.5pt" o:hralign="center" o:hrstd="t" o:hr="t" fillcolor="#a0a0a0" stroked="f"/>
         </w:pict>
       </w:r>
     </w:p>
@@ -6732,7 +6732,7 @@
     <w:p>
       <w:r>
         <w:pict w14:anchorId="560AB259">
-          <v:rect id="_x0000_i1157" style="width:0;height:1.5pt" o:hralign="center" o:hrstd="t" o:hr="t" fillcolor="#a0a0a0" stroked="f"/>
+          <v:rect id="_x0000_i1043" style="width:0;height:1.5pt" o:hralign="center" o:hrstd="t" o:hr="t" fillcolor="#a0a0a0" stroked="f"/>
         </w:pict>
       </w:r>
     </w:p>
@@ -6785,7 +6785,7 @@
     <w:p>
       <w:r>
         <w:pict w14:anchorId="6A4E4406">
-          <v:rect id="_x0000_i1411" style="width:0;height:1.5pt" o:hralign="center" o:hrstd="t" o:hr="t" fillcolor="#a0a0a0" stroked="f"/>
+          <v:rect id="_x0000_i1044" style="width:0;height:1.5pt" o:hralign="center" o:hrstd="t" o:hr="t" fillcolor="#a0a0a0" stroked="f"/>
         </w:pict>
       </w:r>
     </w:p>
@@ -6925,7 +6925,7 @@
     <w:p>
       <w:r>
         <w:pict w14:anchorId="57947CB6">
-          <v:rect id="_x0000_i1412" style="width:0;height:1.5pt" o:hralign="center" o:hrstd="t" o:hr="t" fillcolor="#a0a0a0" stroked="f"/>
+          <v:rect id="_x0000_i1045" style="width:0;height:1.5pt" o:hralign="center" o:hrstd="t" o:hr="t" fillcolor="#a0a0a0" stroked="f"/>
         </w:pict>
       </w:r>
     </w:p>
@@ -7099,7 +7099,7 @@
     <w:p>
       <w:r>
         <w:pict w14:anchorId="7681267C">
-          <v:rect id="_x0000_i1413" style="width:0;height:1.5pt" o:hralign="center" o:hrstd="t" o:hr="t" fillcolor="#a0a0a0" stroked="f"/>
+          <v:rect id="_x0000_i1046" style="width:0;height:1.5pt" o:hralign="center" o:hrstd="t" o:hr="t" fillcolor="#a0a0a0" stroked="f"/>
         </w:pict>
       </w:r>
     </w:p>
@@ -7229,7 +7229,7 @@
     <w:p>
       <w:r>
         <w:pict w14:anchorId="53AE511E">
-          <v:rect id="_x0000_i1414" style="width:0;height:1.5pt" o:hralign="center" o:hrstd="t" o:hr="t" fillcolor="#a0a0a0" stroked="f"/>
+          <v:rect id="_x0000_i1047" style="width:0;height:1.5pt" o:hralign="center" o:hrstd="t" o:hr="t" fillcolor="#a0a0a0" stroked="f"/>
         </w:pict>
       </w:r>
     </w:p>
@@ -7371,7 +7371,7 @@
     <w:p>
       <w:r>
         <w:pict w14:anchorId="616ABF4B">
-          <v:rect id="_x0000_i1415" style="width:0;height:1.5pt" o:hralign="center" o:hrstd="t" o:hr="t" fillcolor="#a0a0a0" stroked="f"/>
+          <v:rect id="_x0000_i1048" style="width:0;height:1.5pt" o:hralign="center" o:hrstd="t" o:hr="t" fillcolor="#a0a0a0" stroked="f"/>
         </w:pict>
       </w:r>
     </w:p>
@@ -7535,7 +7535,7 @@
     <w:p>
       <w:r>
         <w:pict w14:anchorId="57398074">
-          <v:rect id="_x0000_i1416" style="width:0;height:1.5pt" o:hralign="center" o:hrstd="t" o:hr="t" fillcolor="#a0a0a0" stroked="f"/>
+          <v:rect id="_x0000_i1049" style="width:0;height:1.5pt" o:hralign="center" o:hrstd="t" o:hr="t" fillcolor="#a0a0a0" stroked="f"/>
         </w:pict>
       </w:r>
     </w:p>
@@ -7737,7 +7737,7 @@
     <w:p>
       <w:r>
         <w:pict w14:anchorId="5401C4AC">
-          <v:rect id="_x0000_i1417" style="width:0;height:1.5pt" o:hralign="center" o:hrstd="t" o:hr="t" fillcolor="#a0a0a0" stroked="f"/>
+          <v:rect id="_x0000_i1050" style="width:0;height:1.5pt" o:hralign="center" o:hrstd="t" o:hr="t" fillcolor="#a0a0a0" stroked="f"/>
         </w:pict>
       </w:r>
     </w:p>
@@ -7913,7 +7913,7 @@
     <w:p>
       <w:r>
         <w:pict w14:anchorId="62E2CEDA">
-          <v:rect id="_x0000_i1418" style="width:0;height:1.5pt" o:hralign="center" o:hrstd="t" o:hr="t" fillcolor="#a0a0a0" stroked="f"/>
+          <v:rect id="_x0000_i1051" style="width:0;height:1.5pt" o:hralign="center" o:hrstd="t" o:hr="t" fillcolor="#a0a0a0" stroked="f"/>
         </w:pict>
       </w:r>
     </w:p>
@@ -8217,7 +8217,7 @@
     <w:p>
       <w:r>
         <w:pict w14:anchorId="32266F44">
-          <v:rect id="_x0000_i1419" style="width:0;height:1.5pt" o:hralign="center" o:hrstd="t" o:hr="t" fillcolor="#a0a0a0" stroked="f"/>
+          <v:rect id="_x0000_i1052" style="width:0;height:1.5pt" o:hralign="center" o:hrstd="t" o:hr="t" fillcolor="#a0a0a0" stroked="f"/>
         </w:pict>
       </w:r>
     </w:p>
@@ -8550,7 +8550,7 @@
     <w:p>
       <w:r>
         <w:pict w14:anchorId="07875707">
-          <v:rect id="_x0000_i1420" style="width:0;height:1.5pt" o:hralign="center" o:hrstd="t" o:hr="t" fillcolor="#a0a0a0" stroked="f"/>
+          <v:rect id="_x0000_i1053" style="width:0;height:1.5pt" o:hralign="center" o:hrstd="t" o:hr="t" fillcolor="#a0a0a0" stroked="f"/>
         </w:pict>
       </w:r>
     </w:p>
@@ -8830,7 +8830,7 @@
     <w:p>
       <w:r>
         <w:pict w14:anchorId="6E225A6B">
-          <v:rect id="_x0000_i1421" style="width:0;height:1.5pt" o:hralign="center" o:hrstd="t" o:hr="t" fillcolor="#a0a0a0" stroked="f"/>
+          <v:rect id="_x0000_i1054" style="width:0;height:1.5pt" o:hralign="center" o:hrstd="t" o:hr="t" fillcolor="#a0a0a0" stroked="f"/>
         </w:pict>
       </w:r>
     </w:p>
@@ -9029,7 +9029,7 @@
     <w:p>
       <w:r>
         <w:pict w14:anchorId="36F3A186">
-          <v:rect id="_x0000_i1422" style="width:0;height:1.5pt" o:hralign="center" o:hrstd="t" o:hr="t" fillcolor="#a0a0a0" stroked="f"/>
+          <v:rect id="_x0000_i1055" style="width:0;height:1.5pt" o:hralign="center" o:hrstd="t" o:hr="t" fillcolor="#a0a0a0" stroked="f"/>
         </w:pict>
       </w:r>
     </w:p>
@@ -9337,7 +9337,7 @@
     <w:p>
       <w:r>
         <w:pict w14:anchorId="3B8865D3">
-          <v:rect id="_x0000_i1423" style="width:0;height:1.5pt" o:hralign="center" o:hrstd="t" o:hr="t" fillcolor="#a0a0a0" stroked="f"/>
+          <v:rect id="_x0000_i1056" style="width:0;height:1.5pt" o:hralign="center" o:hrstd="t" o:hr="t" fillcolor="#a0a0a0" stroked="f"/>
         </w:pict>
       </w:r>
     </w:p>
@@ -9704,7 +9704,7 @@
     <w:p>
       <w:r>
         <w:pict w14:anchorId="7AB728D0">
-          <v:rect id="_x0000_i1424" style="width:0;height:1.5pt" o:hralign="center" o:hrstd="t" o:hr="t" fillcolor="#a0a0a0" stroked="f"/>
+          <v:rect id="_x0000_i1057" style="width:0;height:1.5pt" o:hralign="center" o:hrstd="t" o:hr="t" fillcolor="#a0a0a0" stroked="f"/>
         </w:pict>
       </w:r>
     </w:p>
@@ -9960,7 +9960,7 @@
     <w:p>
       <w:r>
         <w:pict w14:anchorId="5FA5B99C">
-          <v:rect id="_x0000_i1425" style="width:0;height:1.5pt" o:hralign="center" o:hrstd="t" o:hr="t" fillcolor="#a0a0a0" stroked="f"/>
+          <v:rect id="_x0000_i1058" style="width:0;height:1.5pt" o:hralign="center" o:hrstd="t" o:hr="t" fillcolor="#a0a0a0" stroked="f"/>
         </w:pict>
       </w:r>
     </w:p>
@@ -10369,7 +10369,7 @@
     <w:p>
       <w:r>
         <w:pict w14:anchorId="73CE6DDC">
-          <v:rect id="_x0000_i1426" style="width:0;height:1.5pt" o:hralign="center" o:hrstd="t" o:hr="t" fillcolor="#a0a0a0" stroked="f"/>
+          <v:rect id="_x0000_i1059" style="width:0;height:1.5pt" o:hralign="center" o:hrstd="t" o:hr="t" fillcolor="#a0a0a0" stroked="f"/>
         </w:pict>
       </w:r>
     </w:p>
@@ -10742,7 +10742,7 @@
     <w:p>
       <w:r>
         <w:pict w14:anchorId="5159891B">
-          <v:rect id="_x0000_i1427" style="width:0;height:1.5pt" o:hralign="center" o:hrstd="t" o:hr="t" fillcolor="#a0a0a0" stroked="f"/>
+          <v:rect id="_x0000_i1060" style="width:0;height:1.5pt" o:hralign="center" o:hrstd="t" o:hr="t" fillcolor="#a0a0a0" stroked="f"/>
         </w:pict>
       </w:r>
     </w:p>
@@ -11387,7 +11387,7 @@
     <w:p>
       <w:r>
         <w:pict w14:anchorId="72EDB822">
-          <v:rect id="_x0000_i1428" style="width:0;height:1.5pt" o:hralign="center" o:hrstd="t" o:hr="t" fillcolor="#a0a0a0" stroked="f"/>
+          <v:rect id="_x0000_i1061" style="width:0;height:1.5pt" o:hralign="center" o:hrstd="t" o:hr="t" fillcolor="#a0a0a0" stroked="f"/>
         </w:pict>
       </w:r>
     </w:p>
@@ -11548,7 +11548,7 @@
     <w:p>
       <w:r>
         <w:pict w14:anchorId="24BDDCB3">
-          <v:rect id="_x0000_i1429" style="width:0;height:1.5pt" o:hralign="center" o:hrstd="t" o:hr="t" fillcolor="#a0a0a0" stroked="f"/>
+          <v:rect id="_x0000_i1062" style="width:0;height:1.5pt" o:hralign="center" o:hrstd="t" o:hr="t" fillcolor="#a0a0a0" stroked="f"/>
         </w:pict>
       </w:r>
     </w:p>
@@ -11644,7 +11644,7 @@
     <w:p>
       <w:r>
         <w:pict w14:anchorId="22C88BAE">
-          <v:rect id="_x0000_i1430" style="width:0;height:1.5pt" o:hralign="center" o:hrstd="t" o:hr="t" fillcolor="#a0a0a0" stroked="f"/>
+          <v:rect id="_x0000_i1063" style="width:0;height:1.5pt" o:hralign="center" o:hrstd="t" o:hr="t" fillcolor="#a0a0a0" stroked="f"/>
         </w:pict>
       </w:r>
     </w:p>
@@ -11724,7 +11724,7 @@
     <w:p>
       <w:r>
         <w:pict w14:anchorId="02A36516">
-          <v:rect id="_x0000_i1431" style="width:0;height:1.5pt" o:hralign="center" o:hrstd="t" o:hr="t" fillcolor="#a0a0a0" stroked="f"/>
+          <v:rect id="_x0000_i1064" style="width:0;height:1.5pt" o:hralign="center" o:hrstd="t" o:hr="t" fillcolor="#a0a0a0" stroked="f"/>
         </w:pict>
       </w:r>
     </w:p>
@@ -11984,7 +11984,7 @@
     <w:p>
       <w:r>
         <w:pict w14:anchorId="5169AC6C">
-          <v:rect id="_x0000_i1432" style="width:0;height:1.5pt" o:hralign="center" o:hrstd="t" o:hr="t" fillcolor="#a0a0a0" stroked="f"/>
+          <v:rect id="_x0000_i1065" style="width:0;height:1.5pt" o:hralign="center" o:hrstd="t" o:hr="t" fillcolor="#a0a0a0" stroked="f"/>
         </w:pict>
       </w:r>
     </w:p>
@@ -12124,7 +12124,7 @@
     <w:p>
       <w:r>
         <w:pict w14:anchorId="5E088440">
-          <v:rect id="_x0000_i1433" style="width:0;height:1.5pt" o:hralign="center" o:hrstd="t" o:hr="t" fillcolor="#a0a0a0" stroked="f"/>
+          <v:rect id="_x0000_i1066" style="width:0;height:1.5pt" o:hralign="center" o:hrstd="t" o:hr="t" fillcolor="#a0a0a0" stroked="f"/>
         </w:pict>
       </w:r>
     </w:p>
@@ -12245,7 +12245,7 @@
     <w:p>
       <w:r>
         <w:pict w14:anchorId="07C67401">
-          <v:rect id="_x0000_i1434" style="width:0;height:1.5pt" o:hralign="center" o:hrstd="t" o:hr="t" fillcolor="#a0a0a0" stroked="f"/>
+          <v:rect id="_x0000_i1067" style="width:0;height:1.5pt" o:hralign="center" o:hrstd="t" o:hr="t" fillcolor="#a0a0a0" stroked="f"/>
         </w:pict>
       </w:r>
     </w:p>
@@ -12435,7 +12435,7 @@
     <w:p>
       <w:r>
         <w:pict w14:anchorId="635CFB4A">
-          <v:rect id="_x0000_i1435" style="width:0;height:1.5pt" o:hralign="center" o:hrstd="t" o:hr="t" fillcolor="#a0a0a0" stroked="f"/>
+          <v:rect id="_x0000_i1068" style="width:0;height:1.5pt" o:hralign="center" o:hrstd="t" o:hr="t" fillcolor="#a0a0a0" stroked="f"/>
         </w:pict>
       </w:r>
     </w:p>
@@ -12537,7 +12537,7 @@
     <w:p>
       <w:r>
         <w:pict w14:anchorId="0121372E">
-          <v:rect id="_x0000_i1436" style="width:0;height:1.5pt" o:hralign="center" o:hrstd="t" o:hr="t" fillcolor="#a0a0a0" stroked="f"/>
+          <v:rect id="_x0000_i1069" style="width:0;height:1.5pt" o:hralign="center" o:hrstd="t" o:hr="t" fillcolor="#a0a0a0" stroked="f"/>
         </w:pict>
       </w:r>
     </w:p>
@@ -12593,7 +12593,7 @@
     <w:p>
       <w:r>
         <w:pict w14:anchorId="724E8566">
-          <v:rect id="_x0000_i1437" style="width:0;height:1.5pt" o:hralign="center" o:hrstd="t" o:hr="t" fillcolor="#a0a0a0" stroked="f"/>
+          <v:rect id="_x0000_i1070" style="width:0;height:1.5pt" o:hralign="center" o:hrstd="t" o:hr="t" fillcolor="#a0a0a0" stroked="f"/>
         </w:pict>
       </w:r>
     </w:p>
@@ -12825,7 +12825,7 @@
     <w:p>
       <w:r>
         <w:pict w14:anchorId="496081E8">
-          <v:rect id="_x0000_i1438" style="width:0;height:1.5pt" o:hralign="center" o:hrstd="t" o:hr="t" fillcolor="#a0a0a0" stroked="f"/>
+          <v:rect id="_x0000_i1071" style="width:0;height:1.5pt" o:hralign="center" o:hrstd="t" o:hr="t" fillcolor="#a0a0a0" stroked="f"/>
         </w:pict>
       </w:r>
     </w:p>
@@ -13234,7 +13234,7 @@
     <w:p>
       <w:r>
         <w:pict w14:anchorId="16647D39">
-          <v:rect id="_x0000_i1439" style="width:0;height:1.5pt" o:hralign="center" o:hrstd="t" o:hr="t" fillcolor="#a0a0a0" stroked="f"/>
+          <v:rect id="_x0000_i1072" style="width:0;height:1.5pt" o:hralign="center" o:hrstd="t" o:hr="t" fillcolor="#a0a0a0" stroked="f"/>
         </w:pict>
       </w:r>
     </w:p>
@@ -13511,7 +13511,7 @@
     <w:p>
       <w:r>
         <w:pict w14:anchorId="2824A250">
-          <v:rect id="_x0000_i1440" style="width:0;height:1.5pt" o:hralign="center" o:hrstd="t" o:hr="t" fillcolor="#a0a0a0" stroked="f"/>
+          <v:rect id="_x0000_i1073" style="width:0;height:1.5pt" o:hralign="center" o:hrstd="t" o:hr="t" fillcolor="#a0a0a0" stroked="f"/>
         </w:pict>
       </w:r>
     </w:p>
@@ -13870,7 +13870,7 @@
     <w:p>
       <w:r>
         <w:pict w14:anchorId="2073B028">
-          <v:rect id="_x0000_i1441" style="width:0;height:1.5pt" o:hralign="center" o:hrstd="t" o:hr="t" fillcolor="#a0a0a0" stroked="f"/>
+          <v:rect id="_x0000_i1074" style="width:0;height:1.5pt" o:hralign="center" o:hrstd="t" o:hr="t" fillcolor="#a0a0a0" stroked="f"/>
         </w:pict>
       </w:r>
     </w:p>
@@ -14182,7 +14182,7 @@
     <w:p>
       <w:r>
         <w:pict w14:anchorId="1139A0E3">
-          <v:rect id="_x0000_i1442" style="width:0;height:1.5pt" o:hralign="center" o:hrstd="t" o:hr="t" fillcolor="#a0a0a0" stroked="f"/>
+          <v:rect id="_x0000_i1075" style="width:0;height:1.5pt" o:hralign="center" o:hrstd="t" o:hr="t" fillcolor="#a0a0a0" stroked="f"/>
         </w:pict>
       </w:r>
     </w:p>
@@ -14320,7 +14320,7 @@
     <w:p>
       <w:r>
         <w:pict w14:anchorId="6ADDDA56">
-          <v:rect id="_x0000_i1443" style="width:0;height:1.5pt" o:hralign="center" o:hrstd="t" o:hr="t" fillcolor="#a0a0a0" stroked="f"/>
+          <v:rect id="_x0000_i1076" style="width:0;height:1.5pt" o:hralign="center" o:hrstd="t" o:hr="t" fillcolor="#a0a0a0" stroked="f"/>
         </w:pict>
       </w:r>
     </w:p>
@@ -14693,7 +14693,7 @@
     <w:p>
       <w:r>
         <w:pict w14:anchorId="5C0E0615">
-          <v:rect id="_x0000_i1444" style="width:0;height:1.5pt" o:hralign="center" o:hrstd="t" o:hr="t" fillcolor="#a0a0a0" stroked="f"/>
+          <v:rect id="_x0000_i1077" style="width:0;height:1.5pt" o:hralign="center" o:hrstd="t" o:hr="t" fillcolor="#a0a0a0" stroked="f"/>
         </w:pict>
       </w:r>
     </w:p>
@@ -14757,7 +14757,7 @@
     <w:p>
       <w:r>
         <w:pict w14:anchorId="210C42C0">
-          <v:rect id="_x0000_i1445" style="width:0;height:1.5pt" o:hralign="center" o:hrstd="t" o:hr="t" fillcolor="#a0a0a0" stroked="f"/>
+          <v:rect id="_x0000_i1078" style="width:0;height:1.5pt" o:hralign="center" o:hrstd="t" o:hr="t" fillcolor="#a0a0a0" stroked="f"/>
         </w:pict>
       </w:r>
     </w:p>
@@ -14879,7 +14879,7 @@
     <w:p>
       <w:r>
         <w:pict w14:anchorId="6E698189">
-          <v:rect id="_x0000_i1446" style="width:0;height:1.5pt" o:hralign="center" o:hrstd="t" o:hr="t" fillcolor="#a0a0a0" stroked="f"/>
+          <v:rect id="_x0000_i1079" style="width:0;height:1.5pt" o:hralign="center" o:hrstd="t" o:hr="t" fillcolor="#a0a0a0" stroked="f"/>
         </w:pict>
       </w:r>
     </w:p>
@@ -14953,7 +14953,7 @@
     <w:p>
       <w:r>
         <w:pict w14:anchorId="609B510A">
-          <v:rect id="_x0000_i1447" style="width:0;height:1.5pt" o:hralign="center" o:hrstd="t" o:hr="t" fillcolor="#a0a0a0" stroked="f"/>
+          <v:rect id="_x0000_i1080" style="width:0;height:1.5pt" o:hralign="center" o:hrstd="t" o:hr="t" fillcolor="#a0a0a0" stroked="f"/>
         </w:pict>
       </w:r>
     </w:p>
@@ -15024,7 +15024,7 @@
     <w:p>
       <w:r>
         <w:pict w14:anchorId="4180D89B">
-          <v:rect id="_x0000_i1448" style="width:0;height:1.5pt" o:hralign="center" o:hrstd="t" o:hr="t" fillcolor="#a0a0a0" stroked="f"/>
+          <v:rect id="_x0000_i1081" style="width:0;height:1.5pt" o:hralign="center" o:hrstd="t" o:hr="t" fillcolor="#a0a0a0" stroked="f"/>
         </w:pict>
       </w:r>
     </w:p>
@@ -15126,7 +15126,7 @@
     <w:p>
       <w:r>
         <w:pict w14:anchorId="07028256">
-          <v:rect id="_x0000_i1449" style="width:0;height:1.5pt" o:hralign="center" o:hrstd="t" o:hr="t" fillcolor="#a0a0a0" stroked="f"/>
+          <v:rect id="_x0000_i1082" style="width:0;height:1.5pt" o:hralign="center" o:hrstd="t" o:hr="t" fillcolor="#a0a0a0" stroked="f"/>
         </w:pict>
       </w:r>
     </w:p>
@@ -15227,6 +15227,13 @@
       </w:r>
     </w:p>
     <w:p>
+      <w:pPr>
+        <w:rPr>
+          <w:rFonts w:ascii="Segoe UI Emoji" w:hAnsi="Segoe UI Emoji" w:cs="Segoe UI Emoji"/>
+          <w:b/>
+          <w:bCs/>
+        </w:rPr>
+      </w:pPr>
       <w:r>
         <w:rPr>
           <w:b/>
@@ -15241,6 +15248,1356 @@
           <w:bCs/>
         </w:rPr>
         <w:t>🚀</w:t>
+      </w:r>
+    </w:p>
+    <w:p>
+      <w:pPr>
+        <w:rPr>
+          <w:rFonts w:ascii="Segoe UI Emoji" w:hAnsi="Segoe UI Emoji" w:cs="Segoe UI Emoji"/>
+          <w:b/>
+          <w:bCs/>
+        </w:rPr>
+      </w:pPr>
+    </w:p>
+    <w:p>
+      <w:r>
+        <w:t>COMPLETE SYSTEM FLOW</w:t>
+      </w:r>
+    </w:p>
+    <w:p>
+      <w:r>
+        <w:t>Flow 1: User Asks to Block IP</w:t>
+      </w:r>
+    </w:p>
+    <w:p>
+      <w:r>
+        <w:t>1. USER types in browser: "Check IP 185.220.101.1 and block if malicious"</w:t>
+      </w:r>
+    </w:p>
+    <w:p>
+      <w:r>
+        <w:t xml:space="preserve">   ↓</w:t>
+      </w:r>
+    </w:p>
+    <w:p>
+      <w:r>
+        <w:t>2. BROWSER sends POST /send {"message": "Check IP..."}</w:t>
+      </w:r>
+    </w:p>
+    <w:p>
+      <w:r>
+        <w:t xml:space="preserve">   ↓</w:t>
+      </w:r>
+    </w:p>
+    <w:p>
+      <w:r>
+        <w:t>3. FLASK (web_ui.py) receives request</w:t>
+      </w:r>
+    </w:p>
+    <w:p>
+      <w:r>
+        <w:t xml:space="preserve">   - Gets session_id from cookie</w:t>
+      </w:r>
+    </w:p>
+    <w:p>
+      <w:r>
+        <w:t xml:space="preserve">   - Loads conversation history from flask_session</w:t>
+      </w:r>
+    </w:p>
+    <w:p>
+      <w:r>
+        <w:t xml:space="preserve">   - Adds user message to history</w:t>
+      </w:r>
+    </w:p>
+    <w:p>
+      <w:r>
+        <w:t xml:space="preserve">   ↓</w:t>
+      </w:r>
+    </w:p>
+    <w:p>
+      <w:r>
+        <w:t>4. FLASK spawns MCP subprocess: python server.py</w:t>
+      </w:r>
+    </w:p>
+    <w:p>
+      <w:r>
+        <w:t xml:space="preserve">   ↓</w:t>
+      </w:r>
+    </w:p>
+    <w:p>
+      <w:r>
+        <w:t>5. MCP (server.py) starts up</w:t>
+      </w:r>
+    </w:p>
+    <w:p>
+      <w:r>
+        <w:t xml:space="preserve">   - Loads environment variables</w:t>
+      </w:r>
+    </w:p>
+    <w:p>
+      <w:r>
+        <w:t xml:space="preserve">   - Initializes (ChromaDB if USE_REAL_APIS=true)</w:t>
+      </w:r>
+    </w:p>
+    <w:p>
+      <w:r>
+        <w:t xml:space="preserve">   - Registers all @mcp.tool() functions</w:t>
+      </w:r>
+    </w:p>
+    <w:p>
+      <w:r>
+        <w:t xml:space="preserve">   ↓</w:t>
+      </w:r>
+    </w:p>
+    <w:p>
+      <w:r>
+        <w:t>6. FLASK sends "initialize" to MCP over stdio</w:t>
+      </w:r>
+    </w:p>
+    <w:p>
+      <w:r>
+        <w:t xml:space="preserve">   ↓</w:t>
+      </w:r>
+    </w:p>
+    <w:p>
+      <w:r>
+        <w:t>7. MCP responds with success</w:t>
+      </w:r>
+    </w:p>
+    <w:p>
+      <w:r>
+        <w:t xml:space="preserve">   ↓</w:t>
+      </w:r>
+    </w:p>
+    <w:p>
+      <w:r>
+        <w:t>8. FLASK sends "list_tools" to MCP</w:t>
+      </w:r>
+    </w:p>
+    <w:p>
+      <w:r>
+        <w:lastRenderedPageBreak/>
+        <w:t xml:space="preserve">   ↓</w:t>
+      </w:r>
+    </w:p>
+    <w:p>
+      <w:r>
+        <w:t>9. MCP responds with all tool schemas</w:t>
+      </w:r>
+    </w:p>
+    <w:p>
+      <w:r>
+        <w:t xml:space="preserve">   ↓</w:t>
+      </w:r>
+    </w:p>
+    <w:p>
+      <w:r>
+        <w:t>10. FLASK filters out HUMAN_ONLY_TOOLS</w:t>
+      </w:r>
+    </w:p>
+    <w:p>
+      <w:r>
+        <w:t xml:space="preserve">    - execute_pending_action is HIDDEN from LLM!</w:t>
+      </w:r>
+    </w:p>
+    <w:p>
+      <w:r>
+        <w:t xml:space="preserve">   ↓</w:t>
+      </w:r>
+    </w:p>
+    <w:p>
+      <w:r>
+        <w:t>11. FLASK calls run_agent_turn() from agent_shared.py</w:t>
+      </w:r>
+    </w:p>
+    <w:p>
+      <w:r>
+        <w:t xml:space="preserve">    - Passes: groq_client, messages, tools, mcp_session</w:t>
+      </w:r>
+    </w:p>
+    <w:p>
+      <w:r>
+        <w:t xml:space="preserve">    - confirmation_callback=None (auto-decline execution)</w:t>
+      </w:r>
+    </w:p>
+    <w:p>
+      <w:r>
+        <w:t xml:space="preserve">   ↓</w:t>
+      </w:r>
+    </w:p>
+    <w:p>
+      <w:r>
+        <w:t>12. AGENT LOOP Turn 1:</w:t>
+      </w:r>
+    </w:p>
+    <w:p>
+      <w:r>
+        <w:t xml:space="preserve">    - Calls Groq API with messages and tools</w:t>
+      </w:r>
+    </w:p>
+    <w:p>
+      <w:r>
+        <w:t xml:space="preserve">    - Groq says: "I'll call check_ip_reputation"</w:t>
+      </w:r>
+    </w:p>
+    <w:p>
+      <w:r>
+        <w:t xml:space="preserve">    - LLM returns tool_call: check_ip_reputation(ip="185.220.101.1")</w:t>
+      </w:r>
+    </w:p>
+    <w:p>
+      <w:r>
+        <w:t xml:space="preserve">   ↓</w:t>
+      </w:r>
+    </w:p>
+    <w:p>
+      <w:r>
+        <w:t>13. run_agent_turn() calls MCP tool</w:t>
+      </w:r>
+    </w:p>
+    <w:p>
+      <w:r>
+        <w:t xml:space="preserve">    - session.call_tool("check_ip_reputation", {"ip": "185.220.101.1"})</w:t>
+      </w:r>
+    </w:p>
+    <w:p>
+      <w:r>
+        <w:t xml:space="preserve">   ↓</w:t>
+      </w:r>
+    </w:p>
+    <w:p>
+      <w:r>
+        <w:t>14. MCP (server.py) executes check_ip_reputation_real()</w:t>
+      </w:r>
+    </w:p>
+    <w:p>
+      <w:r>
+        <w:t xml:space="preserve">    - Calls AbuseIPDB API</w:t>
+      </w:r>
+    </w:p>
+    <w:p>
+      <w:r>
+        <w:t xml:space="preserve">    - Gets abuse_score: 100</w:t>
+      </w:r>
+    </w:p>
+    <w:p>
+      <w:r>
+        <w:t xml:space="preserve">    - Generates evidence_token: "a3f5c8e9"</w:t>
+      </w:r>
+    </w:p>
+    <w:p>
+      <w:r>
+        <w:t xml:space="preserve">    - Stores in REPUTATION_RESULTS (in-memory)</w:t>
+      </w:r>
+    </w:p>
+    <w:p>
+      <w:r>
+        <w:t xml:space="preserve">    - Returns JSON with result_token</w:t>
+      </w:r>
+    </w:p>
+    <w:p>
+      <w:r>
+        <w:t xml:space="preserve">   ↓</w:t>
+      </w:r>
+    </w:p>
+    <w:p>
+      <w:r>
+        <w:t>15. AGENT LOOP Turn 2:</w:t>
+      </w:r>
+    </w:p>
+    <w:p>
+      <w:r>
+        <w:t xml:space="preserve">    - Adds tool result to messages</w:t>
+      </w:r>
+    </w:p>
+    <w:p>
+      <w:r>
+        <w:t xml:space="preserve">    - Calls Groq API again</w:t>
+      </w:r>
+    </w:p>
+    <w:p>
+      <w:r>
+        <w:t xml:space="preserve">    - Groq says: "IP is highly malicious. I'll propose blocking it."</w:t>
+      </w:r>
+    </w:p>
+    <w:p>
+      <w:r>
+        <w:t xml:space="preserve">    - LLM returns tool_call: propose_block_ip(ip="185.220.101.1", reason="...")</w:t>
+      </w:r>
+    </w:p>
+    <w:p>
+      <w:r>
+        <w:t xml:space="preserve">   ↓</w:t>
+      </w:r>
+    </w:p>
+    <w:p>
+      <w:r>
+        <w:lastRenderedPageBreak/>
+        <w:t>16. run_agent_turn() calls MCP tool</w:t>
+      </w:r>
+    </w:p>
+    <w:p>
+      <w:r>
+        <w:t xml:space="preserve">    - session.call_tool("propose_block_ip", {...})</w:t>
+      </w:r>
+    </w:p>
+    <w:p>
+      <w:r>
+        <w:t xml:space="preserve">   ↓</w:t>
+      </w:r>
+    </w:p>
+    <w:p>
+      <w:r>
+        <w:t>17. MCP (server.py) executes propose_block_ip()</w:t>
+      </w:r>
+    </w:p>
+    <w:p>
+      <w:r>
+        <w:t xml:space="preserve">    - Validates IP (not loopback, etc.)</w:t>
+      </w:r>
+    </w:p>
+    <w:p>
+      <w:r>
+        <w:t xml:space="preserve">    - Generates token: "b7d4e2f1"</w:t>
+      </w:r>
+    </w:p>
+    <w:p>
+      <w:r>
+        <w:t xml:space="preserve">    - Writes to data/pending_actions.json:</w:t>
+      </w:r>
+    </w:p>
+    <w:p>
+      <w:r>
+        <w:t xml:space="preserve">      {</w:t>
+      </w:r>
+    </w:p>
+    <w:p>
+      <w:r>
+        <w:t xml:space="preserve">        "b7d4e2f1": {</w:t>
+      </w:r>
+    </w:p>
+    <w:p>
+      <w:r>
+        <w:t xml:space="preserve">          "action_type": "block_ip",</w:t>
+      </w:r>
+    </w:p>
+    <w:p>
+      <w:r>
+        <w:t xml:space="preserve">          "ip": "185.220.101.1",</w:t>
+      </w:r>
+    </w:p>
+    <w:p>
+      <w:r>
+        <w:t xml:space="preserve">          "reason": "...",</w:t>
+      </w:r>
+    </w:p>
+    <w:p>
+      <w:r>
+        <w:t xml:space="preserve">          "status": "pending",</w:t>
+      </w:r>
+    </w:p>
+    <w:p>
+      <w:r>
+        <w:t xml:space="preserve">          "created_at": "2026-01-21 10:30:00"</w:t>
+      </w:r>
+    </w:p>
+    <w:p>
+      <w:r>
+        <w:t xml:space="preserve">        }</w:t>
+      </w:r>
+    </w:p>
+    <w:p>
+      <w:r>
+        <w:t xml:space="preserve">      }</w:t>
+      </w:r>
+    </w:p>
+    <w:p>
+      <w:r>
+        <w:t xml:space="preserve">    - Returns "PREVIEW: Would block IP... Token: b7d4e2f1"</w:t>
+      </w:r>
+    </w:p>
+    <w:p>
+      <w:r>
+        <w:t xml:space="preserve">   ↓</w:t>
+      </w:r>
+    </w:p>
+    <w:p>
+      <w:r>
+        <w:t>18. AGENT LOOP Turn 3:</w:t>
+      </w:r>
+    </w:p>
+    <w:p>
+      <w:r>
+        <w:t xml:space="preserve">    - Adds tool result to messages</w:t>
+      </w:r>
+    </w:p>
+    <w:p>
+      <w:r>
+        <w:t xml:space="preserve">    - Calls Groq API again</w:t>
+      </w:r>
+    </w:p>
+    <w:p>
+      <w:r>
+        <w:t xml:space="preserve">    - Groq says: "I've proposed blocking the IP. Awaiting confirmation."</w:t>
+      </w:r>
+    </w:p>
+    <w:p>
+      <w:r>
+        <w:t xml:space="preserve">    - LLM returns NO tool calls, just content</w:t>
+      </w:r>
+    </w:p>
+    <w:p>
+      <w:r>
+        <w:t xml:space="preserve">   ↓</w:t>
+      </w:r>
+    </w:p>
+    <w:p>
+      <w:r>
+        <w:t>19. run_agent_turn() exits loop</w:t>
+      </w:r>
+    </w:p>
+    <w:p>
+      <w:r>
+        <w:t xml:space="preserve">    - Returns (updated_messages, final_response)</w:t>
+      </w:r>
+    </w:p>
+    <w:p>
+      <w:r>
+        <w:t xml:space="preserve">   ↓</w:t>
+      </w:r>
+    </w:p>
+    <w:p>
+      <w:r>
+        <w:t>20. FLASK (web_ui.py) gets result</w:t>
+      </w:r>
+    </w:p>
+    <w:p>
+      <w:r>
+        <w:t xml:space="preserve">    - Saves updated messages to flask_session</w:t>
+      </w:r>
+    </w:p>
+    <w:p>
+      <w:r>
+        <w:t xml:space="preserve">    - Calls build_transcript_entries()</w:t>
+      </w:r>
+    </w:p>
+    <w:p>
+      <w:r>
+        <w:t xml:space="preserve">   ↓</w:t>
+      </w:r>
+    </w:p>
+    <w:p>
+      <w:r>
+        <w:lastRenderedPageBreak/>
+        <w:t>21. build_transcript_entries() processes messages</w:t>
+      </w:r>
+    </w:p>
+    <w:p>
+      <w:r>
+        <w:t xml:space="preserve">    - Detects tool result has "Token: b7d4e2f1"</w:t>
+      </w:r>
+    </w:p>
+    <w:p>
+      <w:r>
+        <w:t xml:space="preserve">    - Reads data/pending_actions.json</w:t>
+      </w:r>
+    </w:p>
+    <w:p>
+      <w:r>
+        <w:t xml:space="preserve">    - Updates action with Flask metadata:</w:t>
+      </w:r>
+    </w:p>
+    <w:p>
+      <w:r>
+        <w:t xml:space="preserve">      {</w:t>
+      </w:r>
+    </w:p>
+    <w:p>
+      <w:r>
+        <w:t xml:space="preserve">        "b7d4e2f1": {</w:t>
+      </w:r>
+    </w:p>
+    <w:p>
+      <w:r>
+        <w:t xml:space="preserve">          ...existing fields...,</w:t>
+      </w:r>
+    </w:p>
+    <w:p>
+      <w:r>
+        <w:t xml:space="preserve">          "session_id": "user-session-123",</w:t>
+      </w:r>
+    </w:p>
+    <w:p>
+      <w:r>
+        <w:t xml:space="preserve">          "preview_text": "PREVIEW: Would block IP..."</w:t>
+      </w:r>
+    </w:p>
+    <w:p>
+      <w:r>
+        <w:t xml:space="preserve">        }</w:t>
+      </w:r>
+    </w:p>
+    <w:p>
+      <w:r>
+        <w:t xml:space="preserve">      }</w:t>
+      </w:r>
+    </w:p>
+    <w:p>
+      <w:r>
+        <w:t xml:space="preserve">    - Creates transcript entry:</w:t>
+      </w:r>
+    </w:p>
+    <w:p>
+      <w:r>
+        <w:t xml:space="preserve">      {</w:t>
+      </w:r>
+    </w:p>
+    <w:p>
+      <w:r>
+        <w:t xml:space="preserve">        "type": "pending_confirmation",</w:t>
+      </w:r>
+    </w:p>
+    <w:p>
+      <w:r>
+        <w:t xml:space="preserve">        "token": "b7d4e2f1",</w:t>
+      </w:r>
+    </w:p>
+    <w:p>
+      <w:r>
+        <w:t xml:space="preserve">        "content": "PREVIEW: Would block IP..."</w:t>
+      </w:r>
+    </w:p>
+    <w:p>
+      <w:r>
+        <w:t xml:space="preserve">      }</w:t>
+      </w:r>
+    </w:p>
+    <w:p>
+      <w:r>
+        <w:t xml:space="preserve">   ↓</w:t>
+      </w:r>
+    </w:p>
+    <w:p>
+      <w:r>
+        <w:t>22. FLASK responds to browser</w:t>
+      </w:r>
+    </w:p>
+    <w:p>
+      <w:r>
+        <w:t xml:space="preserve">    - Returns JSON: {"success": true, "transcript": [...]}</w:t>
+      </w:r>
+    </w:p>
+    <w:p>
+      <w:r>
+        <w:t xml:space="preserve">   ↓</w:t>
+      </w:r>
+    </w:p>
+    <w:p>
+      <w:r>
+        <w:t>23. BROWSER (index.html) receives response</w:t>
+      </w:r>
+    </w:p>
+    <w:p>
+      <w:r>
+        <w:t xml:space="preserve">    - JavaScript processes transcript</w:t>
+      </w:r>
+    </w:p>
+    <w:p>
+      <w:r>
+        <w:t xml:space="preserve">    - Finds "pending_confirmation" entry</w:t>
+      </w:r>
+    </w:p>
+    <w:p>
+      <w:r>
+        <w:t xml:space="preserve">    - Renders orange box with [Confirm] [Decline] buttons</w:t>
+      </w:r>
+    </w:p>
+    <w:p>
+      <w:r>
+        <w:t xml:space="preserve">   ↓</w:t>
+      </w:r>
+    </w:p>
+    <w:p>
+      <w:r>
+        <w:t>24. USER clicks [Confirm] button</w:t>
+      </w:r>
+    </w:p>
+    <w:p>
+      <w:r>
+        <w:t xml:space="preserve">   ↓</w:t>
+      </w:r>
+    </w:p>
+    <w:p>
+      <w:r>
+        <w:t>25. BROWSER sends POST /confirm/b7d4e2f1</w:t>
+      </w:r>
+    </w:p>
+    <w:p>
+      <w:r>
+        <w:t xml:space="preserve">   ↓</w:t>
+      </w:r>
+    </w:p>
+    <w:p>
+      <w:r>
+        <w:t>26. FLASK (web_ui.py) receives confirm request</w:t>
+      </w:r>
+    </w:p>
+    <w:p>
+      <w:r>
+        <w:lastRenderedPageBreak/>
+        <w:t xml:space="preserve">    - confirm_action(token="b7d4e2f1")</w:t>
+      </w:r>
+    </w:p>
+    <w:p>
+      <w:r>
+        <w:t xml:space="preserve">    - GATE 1: Reads data/pending_actions.json, checks token exists </w:t>
+      </w:r>
+      <w:r>
+        <w:rPr>
+          <w:rFonts w:ascii="Segoe UI Symbol" w:hAnsi="Segoe UI Symbol" w:cs="Segoe UI Symbol"/>
+        </w:rPr>
+        <w:t>✓</w:t>
+      </w:r>
+    </w:p>
+    <w:p>
+      <w:r>
+        <w:t xml:space="preserve">    - GATE 2: Checks action["session_id"] == current session </w:t>
+      </w:r>
+      <w:r>
+        <w:rPr>
+          <w:rFonts w:ascii="Segoe UI Symbol" w:hAnsi="Segoe UI Symbol" w:cs="Segoe UI Symbol"/>
+        </w:rPr>
+        <w:t>✓</w:t>
+      </w:r>
+    </w:p>
+    <w:p>
+      <w:r>
+        <w:t xml:space="preserve">    - GATE 3: Checks action["status"] == "pending" </w:t>
+      </w:r>
+      <w:r>
+        <w:rPr>
+          <w:rFonts w:ascii="Segoe UI Symbol" w:hAnsi="Segoe UI Symbol" w:cs="Segoe UI Symbol"/>
+        </w:rPr>
+        <w:t>✓</w:t>
+      </w:r>
+    </w:p>
+    <w:p>
+      <w:r>
+        <w:t xml:space="preserve">    - Updates file:</w:t>
+      </w:r>
+    </w:p>
+    <w:p>
+      <w:r>
+        <w:t xml:space="preserve">      {</w:t>
+      </w:r>
+    </w:p>
+    <w:p>
+      <w:r>
+        <w:t xml:space="preserve">        "b7d4e2f1": {</w:t>
+      </w:r>
+    </w:p>
+    <w:p>
+      <w:r>
+        <w:t xml:space="preserve">          ...existing fields...,</w:t>
+      </w:r>
+    </w:p>
+    <w:p>
+      <w:r>
+        <w:t xml:space="preserve">          "status": "confirmed",  # CHANGED!</w:t>
+      </w:r>
+    </w:p>
+    <w:p>
+      <w:r>
+        <w:t xml:space="preserve">          "confirmed_at": "2026-01-21 10:31:00"</w:t>
+      </w:r>
+    </w:p>
+    <w:p>
+      <w:r>
+        <w:t xml:space="preserve">        }</w:t>
+      </w:r>
+    </w:p>
+    <w:p>
+      <w:r>
+        <w:t xml:space="preserve">      }</w:t>
+      </w:r>
+    </w:p>
+    <w:p>
+      <w:r>
+        <w:t xml:space="preserve">   ↓</w:t>
+      </w:r>
+    </w:p>
+    <w:p>
+      <w:r>
+        <w:t>27. FLASK spawns NEW MCP subprocess</w:t>
+      </w:r>
+    </w:p>
+    <w:p>
+      <w:r>
+        <w:t xml:space="preserve">    - python server.py (fresh process, new evidence tokens)</w:t>
+      </w:r>
+    </w:p>
+    <w:p>
+      <w:r>
+        <w:t xml:space="preserve">   ↓</w:t>
+      </w:r>
+    </w:p>
+    <w:p>
+      <w:r>
+        <w:t>28. FLASK calls MCP tool</w:t>
+      </w:r>
+    </w:p>
+    <w:p>
+      <w:r>
+        <w:t xml:space="preserve">    - session.call_tool("execute_pending_action", {"token": "b7d4e2f1"})</w:t>
+      </w:r>
+    </w:p>
+    <w:p>
+      <w:r>
+        <w:t xml:space="preserve">   ↓</w:t>
+      </w:r>
+    </w:p>
+    <w:p>
+      <w:r>
+        <w:t>29. MCP (server.py) executes execute_pending_action()</w:t>
+      </w:r>
+    </w:p>
+    <w:p>
+      <w:r>
+        <w:t xml:space="preserve">    - Reads data/pending_actions.json</w:t>
+      </w:r>
+    </w:p>
+    <w:p>
+      <w:r>
+        <w:t xml:space="preserve">    - Validates status == "confirmed" </w:t>
+      </w:r>
+      <w:r>
+        <w:rPr>
+          <w:rFonts w:ascii="Segoe UI Symbol" w:hAnsi="Segoe UI Symbol" w:cs="Segoe UI Symbol"/>
+        </w:rPr>
+        <w:t>✓</w:t>
+      </w:r>
+    </w:p>
+    <w:p>
+      <w:r>
+        <w:t xml:space="preserve">    - Calls execute_block_ip_real()</w:t>
+      </w:r>
+    </w:p>
+    <w:p>
+      <w:r>
+        <w:t xml:space="preserve">      - Creates data/firewall_sandbox/block_185_220_101_1.rule</w:t>
+      </w:r>
+    </w:p>
+    <w:p>
+      <w:r>
+        <w:t xml:space="preserve">      - Writes JSON file with rule details</w:t>
+      </w:r>
+    </w:p>
+    <w:p>
+      <w:r>
+        <w:t xml:space="preserve">      - Logs to data/action_log.jsonl</w:t>
+      </w:r>
+    </w:p>
+    <w:p>
+      <w:r>
+        <w:t xml:space="preserve">    - Updates file:</w:t>
+      </w:r>
+    </w:p>
+    <w:p>
+      <w:r>
+        <w:t xml:space="preserve">      {</w:t>
+      </w:r>
+    </w:p>
+    <w:p>
+      <w:r>
+        <w:t xml:space="preserve">        "b7d4e2f1": {</w:t>
+      </w:r>
+    </w:p>
+    <w:p>
+      <w:r>
+        <w:t xml:space="preserve">          ...existing fields...,</w:t>
+      </w:r>
+    </w:p>
+    <w:p>
+      <w:r>
+        <w:t xml:space="preserve">          "status": "executed",  # CHANGED!</w:t>
+      </w:r>
+    </w:p>
+    <w:p>
+      <w:r>
+        <w:lastRenderedPageBreak/>
+        <w:t xml:space="preserve">          "executed_at": "2026-01-21 10:31:05"</w:t>
+      </w:r>
+    </w:p>
+    <w:p>
+      <w:r>
+        <w:t xml:space="preserve">        }</w:t>
+      </w:r>
+    </w:p>
+    <w:p>
+      <w:r>
+        <w:t xml:space="preserve">      }</w:t>
+      </w:r>
+    </w:p>
+    <w:p>
+      <w:r>
+        <w:t xml:space="preserve">    - Returns "SUCCESS [SANDBOX]: Blocked IP 185.220.101.1..."</w:t>
+      </w:r>
+    </w:p>
+    <w:p>
+      <w:r>
+        <w:t xml:space="preserve">   ↓</w:t>
+      </w:r>
+    </w:p>
+    <w:p>
+      <w:r>
+        <w:t>30. FLASK responds to browser</w:t>
+      </w:r>
+    </w:p>
+    <w:p>
+      <w:r>
+        <w:t xml:space="preserve">    - Returns JSON: {"success": true, "result": "SUCCESS..."}</w:t>
+      </w:r>
+    </w:p>
+    <w:p>
+      <w:r>
+        <w:t xml:space="preserve">   ↓</w:t>
+      </w:r>
+    </w:p>
+    <w:p>
+      <w:r>
+        <w:t>31. BROWSER (index.html) receives response</w:t>
+      </w:r>
+    </w:p>
+    <w:p>
+      <w:r>
+        <w:t xml:space="preserve">    - JavaScript updates UI</w:t>
+      </w:r>
+    </w:p>
+    <w:p>
+      <w:r>
+        <w:t xml:space="preserve">    - Shows green box: "</w:t>
+      </w:r>
+      <w:r>
+        <w:rPr>
+          <w:rFonts w:ascii="Segoe UI Symbol" w:hAnsi="Segoe UI Symbol" w:cs="Segoe UI Symbol"/>
+        </w:rPr>
+        <w:t>✓</w:t>
+      </w:r>
+      <w:r>
+        <w:t xml:space="preserve"> Action executed"</w:t>
+      </w:r>
+    </w:p>
+    <w:p>
+      <w:r>
+        <w:t xml:space="preserve">    - Hides [Confirm] [Decline] buttons</w:t>
+      </w:r>
+    </w:p>
+    <w:p>
+      <w:r>
+        <w:t>Flow 2: What Happens If User Clicks [Decline]?</w:t>
+      </w:r>
+    </w:p>
+    <w:p>
+      <w:r>
+        <w:t>Steps 1-24 same as above</w:t>
+      </w:r>
+    </w:p>
+    <w:p>
+      <w:r>
+        <w:t xml:space="preserve">   ↓</w:t>
+      </w:r>
+    </w:p>
+    <w:p>
+      <w:r>
+        <w:t>25. USER clicks [Decline] button</w:t>
+      </w:r>
+    </w:p>
+    <w:p>
+      <w:r>
+        <w:t xml:space="preserve">   ↓</w:t>
+      </w:r>
+    </w:p>
+    <w:p>
+      <w:r>
+        <w:t>26. BROWSER sends POST /decline/b7d4e2f1</w:t>
+      </w:r>
+    </w:p>
+    <w:p>
+      <w:r>
+        <w:t xml:space="preserve">   ↓</w:t>
+      </w:r>
+    </w:p>
+    <w:p>
+      <w:r>
+        <w:t>27. FLASK (web_ui.py) receives decline request</w:t>
+      </w:r>
+    </w:p>
+    <w:p>
+      <w:r>
+        <w:t xml:space="preserve">    - decline_action(token="b7d4e2f1")</w:t>
+      </w:r>
+    </w:p>
+    <w:p>
+      <w:r>
+        <w:t xml:space="preserve">    - GATE 1: Token exists </w:t>
+      </w:r>
+      <w:r>
+        <w:rPr>
+          <w:rFonts w:ascii="Segoe UI Symbol" w:hAnsi="Segoe UI Symbol" w:cs="Segoe UI Symbol"/>
+        </w:rPr>
+        <w:t>✓</w:t>
+      </w:r>
+    </w:p>
+    <w:p>
+      <w:r>
+        <w:t xml:space="preserve">    - GATE 2: Session matches </w:t>
+      </w:r>
+      <w:r>
+        <w:rPr>
+          <w:rFonts w:ascii="Segoe UI Symbol" w:hAnsi="Segoe UI Symbol" w:cs="Segoe UI Symbol"/>
+        </w:rPr>
+        <w:t>✓</w:t>
+      </w:r>
+    </w:p>
+    <w:p>
+      <w:r>
+        <w:t xml:space="preserve">    - GATE 3: Status is pending </w:t>
+      </w:r>
+      <w:r>
+        <w:rPr>
+          <w:rFonts w:ascii="Segoe UI Symbol" w:hAnsi="Segoe UI Symbol" w:cs="Segoe UI Symbol"/>
+        </w:rPr>
+        <w:t>✓</w:t>
+      </w:r>
+    </w:p>
+    <w:p>
+      <w:r>
+        <w:t xml:space="preserve">    - Updates file:</w:t>
+      </w:r>
+    </w:p>
+    <w:p>
+      <w:r>
+        <w:t xml:space="preserve">      {</w:t>
+      </w:r>
+    </w:p>
+    <w:p>
+      <w:r>
+        <w:t xml:space="preserve">        "b7d4e2f1": {</w:t>
+      </w:r>
+    </w:p>
+    <w:p>
+      <w:r>
+        <w:t xml:space="preserve">          ...existing fields...,</w:t>
+      </w:r>
+    </w:p>
+    <w:p>
+      <w:r>
+        <w:t xml:space="preserve">          "status": "declined",  # CHANGED!</w:t>
+      </w:r>
+    </w:p>
+    <w:p>
+      <w:r>
+        <w:t xml:space="preserve">          "declined_at": "2026-01-21 10:31:00"</w:t>
+      </w:r>
+    </w:p>
+    <w:p>
+      <w:r>
+        <w:t xml:space="preserve">        }</w:t>
+      </w:r>
+    </w:p>
+    <w:p>
+      <w:r>
+        <w:lastRenderedPageBreak/>
+        <w:t xml:space="preserve">      }</w:t>
+      </w:r>
+    </w:p>
+    <w:p>
+      <w:r>
+        <w:t xml:space="preserve">    - DOES NOT spawn MCP subprocess</w:t>
+      </w:r>
+    </w:p>
+    <w:p>
+      <w:r>
+        <w:t xml:space="preserve">    - DOES NOT call execute_pending_action</w:t>
+      </w:r>
+    </w:p>
+    <w:p>
+      <w:r>
+        <w:t xml:space="preserve">   ↓</w:t>
+      </w:r>
+    </w:p>
+    <w:p>
+      <w:r>
+        <w:t>28. FLASK responds to browser</w:t>
+      </w:r>
+    </w:p>
+    <w:p>
+      <w:r>
+        <w:t xml:space="preserve">    - Returns JSON: {"success": true, "message": "Action declined"}</w:t>
+      </w:r>
+    </w:p>
+    <w:p>
+      <w:r>
+        <w:t xml:space="preserve">   ↓</w:t>
+      </w:r>
+    </w:p>
+    <w:p>
+      <w:r>
+        <w:t>29. BROWSER updates UI</w:t>
+      </w:r>
+    </w:p>
+    <w:p>
+      <w:r>
+        <w:t xml:space="preserve">    - Shows gray box: "Action declined. Not executed."</w:t>
+      </w:r>
+    </w:p>
+    <w:p>
+      <w:r>
+        <w:rPr>
+          <w:rFonts w:ascii="Segoe UI Emoji" w:hAnsi="Segoe UI Emoji" w:cs="Segoe UI Emoji"/>
+        </w:rPr>
+        <w:t>🔐</w:t>
+      </w:r>
+      <w:r>
+        <w:t xml:space="preserve"> SECURITY MECHANISMS</w:t>
+      </w:r>
+    </w:p>
+    <w:p>
+      <w:r>
+        <w:t>1. Evidence Chain Integrity</w:t>
+      </w:r>
+    </w:p>
+    <w:p>
+      <w:r>
+        <w:t># Step 1: Agent checks IP</w:t>
+      </w:r>
+    </w:p>
+    <w:p>
+      <w:r>
+        <w:t>result = check_ip_reputation("185.220.101.1")</w:t>
+      </w:r>
+    </w:p>
+    <w:p>
+      <w:r>
+        <w:t># Returns: {"abuse_score": 100, "result_token": "a3f5c8e9"}</w:t>
+      </w:r>
+    </w:p>
+    <w:p/>
+    <w:p>
+      <w:r>
+        <w:t># Step 2: Agent tries to create incident</w:t>
+      </w:r>
+    </w:p>
+    <w:p>
+      <w:r>
+        <w:t>create_incident(</w:t>
+      </w:r>
+    </w:p>
+    <w:p>
+      <w:r>
+        <w:t xml:space="preserve">    summary="Malicious IP",</w:t>
+      </w:r>
+    </w:p>
+    <w:p>
+      <w:r>
+        <w:t xml:space="preserve">    severity="high",</w:t>
+      </w:r>
+    </w:p>
+    <w:p>
+      <w:r>
+        <w:t xml:space="preserve">    related_ip="185.220.101.1",</w:t>
+      </w:r>
+    </w:p>
+    <w:p>
+      <w:r>
+        <w:t xml:space="preserve">    evidence_token="a3f5c8e9"  # MUST provide this!</w:t>
+      </w:r>
+    </w:p>
+    <w:p>
+      <w:r>
+        <w:t>)</w:t>
+      </w:r>
+    </w:p>
+    <w:p/>
+    <w:p>
+      <w:r>
+        <w:t># Server validates:</w:t>
+      </w:r>
+    </w:p>
+    <w:p>
+      <w:r>
+        <w:t>if severity in ("high", "critical"):</w:t>
+      </w:r>
+    </w:p>
+    <w:p>
+      <w:r>
+        <w:t xml:space="preserve">    if evidence_token not in REPUTATION_RESULTS:</w:t>
+      </w:r>
+    </w:p>
+    <w:p>
+      <w:r>
+        <w:t xml:space="preserve">        return "REJECTED: Invalid evidence token"</w:t>
+      </w:r>
+    </w:p>
+    <w:p>
+      <w:r>
+        <w:t xml:space="preserve">    </w:t>
+      </w:r>
+    </w:p>
+    <w:p>
+      <w:r>
+        <w:t xml:space="preserve">    evidence = REPUTATION_RESULTS[evidence_token]</w:t>
+      </w:r>
+    </w:p>
+    <w:p>
+      <w:r>
+        <w:t xml:space="preserve">    if not evidence["is_malicious"]:</w:t>
+      </w:r>
+    </w:p>
+    <w:p>
+      <w:r>
+        <w:t xml:space="preserve">        return "REJECTED: Evidence doesn't support claim"</w:t>
+      </w:r>
+    </w:p>
+    <w:p>
+      <w:r>
+        <w:lastRenderedPageBreak/>
+        <w:t>Why?</w:t>
+      </w:r>
+    </w:p>
+    <w:p/>
+    <w:p>
+      <w:r>
+        <w:t>Agent can't fabricate high-severity incidents</w:t>
+      </w:r>
+    </w:p>
+    <w:p>
+      <w:r>
+        <w:t>Must provide proof it actually checked reputation</w:t>
+      </w:r>
+    </w:p>
+    <w:p>
+      <w:r>
+        <w:t>Token is stored in MCP process memory (temporary)</w:t>
+      </w:r>
+    </w:p>
+    <w:p>
+      <w:r>
+        <w:t>2. Propose/Execute Split</w:t>
+      </w:r>
+    </w:p>
+    <w:p>
+      <w:r>
+        <w:t># Phase 1: Propose (agent can call)</w:t>
+      </w:r>
+    </w:p>
+    <w:p>
+      <w:r>
+        <w:t>@mcp.tool()</w:t>
+      </w:r>
+    </w:p>
+    <w:p>
+      <w:r>
+        <w:t>def propose_block_ip(ip, reason):</w:t>
+      </w:r>
+    </w:p>
+    <w:p>
+      <w:r>
+        <w:t xml:space="preserve">    token = generate_token()</w:t>
+      </w:r>
+    </w:p>
+    <w:p>
+      <w:r>
+        <w:t xml:space="preserve">    save_to_file(token, {"status": "pending"})</w:t>
+      </w:r>
+    </w:p>
+    <w:p>
+      <w:r>
+        <w:t xml:space="preserve">    return f"Token: {token}\nAwaiting confirmation"</w:t>
+      </w:r>
+    </w:p>
+    <w:p/>
+    <w:p>
+      <w:r>
+        <w:t># Phase 2: Execute (human-only)</w:t>
+      </w:r>
+    </w:p>
+    <w:p>
+      <w:r>
+        <w:t># This tool is HIDDEN from LLM!</w:t>
+      </w:r>
+    </w:p>
+    <w:p>
+      <w:r>
+        <w:t>@mcp.tool()</w:t>
+      </w:r>
+    </w:p>
+    <w:p>
+      <w:r>
+        <w:t>def execute_pending_action(token):</w:t>
+      </w:r>
+    </w:p>
+    <w:p>
+      <w:r>
+        <w:t xml:space="preserve">    action = load_from_file(token)</w:t>
+      </w:r>
+    </w:p>
+    <w:p>
+      <w:r>
+        <w:t xml:space="preserve">    if action["status"] != "confirmed":</w:t>
+      </w:r>
+    </w:p>
+    <w:p>
+      <w:r>
+        <w:t xml:space="preserve">        return "Error: Not confirmed"</w:t>
+      </w:r>
+    </w:p>
+    <w:p>
+      <w:r>
+        <w:t xml:space="preserve">    actually_block_ip(action["ip"])</w:t>
+      </w:r>
+    </w:p>
+    <w:p>
+      <w:r>
+        <w:t>Why?</w:t>
+      </w:r>
+    </w:p>
+    <w:p/>
+    <w:p>
+      <w:r>
+        <w:t>Agent can't execute directly</w:t>
+      </w:r>
+    </w:p>
+    <w:p>
+      <w:r>
+        <w:t>Human confirmation required</w:t>
+      </w:r>
+    </w:p>
+    <w:p>
+      <w:r>
+        <w:t>Flask /confirm route is ONLY path to execution</w:t>
+      </w:r>
+    </w:p>
+    <w:p>
+      <w:r>
+        <w:t>3. Multi-Gate Validation</w:t>
+      </w:r>
+    </w:p>
+    <w:p>
+      <w:r>
+        <w:t>@app.route('/confirm/&lt;token&gt;', methods=['POST'])</w:t>
+      </w:r>
+    </w:p>
+    <w:p>
+      <w:r>
+        <w:t>def confirm_action(token):</w:t>
+      </w:r>
+    </w:p>
+    <w:p>
+      <w:r>
+        <w:t xml:space="preserve">    pending = get_pending_action(token)</w:t>
+      </w:r>
+    </w:p>
+    <w:p>
+      <w:r>
+        <w:t xml:space="preserve">    </w:t>
+      </w:r>
+    </w:p>
+    <w:p>
+      <w:r>
+        <w:lastRenderedPageBreak/>
+        <w:t xml:space="preserve">    # Gate 1: Existence</w:t>
+      </w:r>
+    </w:p>
+    <w:p>
+      <w:r>
+        <w:t xml:space="preserve">    if not pending:</w:t>
+      </w:r>
+    </w:p>
+    <w:p>
+      <w:r>
+        <w:t xml:space="preserve">        return 404  # Token doesn't exist</w:t>
+      </w:r>
+    </w:p>
+    <w:p>
+      <w:r>
+        <w:t xml:space="preserve">    </w:t>
+      </w:r>
+    </w:p>
+    <w:p>
+      <w:r>
+        <w:t xml:space="preserve">    # Gate 2: Ownership</w:t>
+      </w:r>
+    </w:p>
+    <w:p>
+      <w:r>
+        <w:t xml:space="preserve">    if pending['session_id'] != current_session:</w:t>
+      </w:r>
+    </w:p>
+    <w:p>
+      <w:r>
+        <w:t xml:space="preserve">        return 403  # Not your token</w:t>
+      </w:r>
+    </w:p>
+    <w:p>
+      <w:r>
+        <w:t xml:space="preserve">    </w:t>
+      </w:r>
+    </w:p>
+    <w:p>
+      <w:r>
+        <w:t xml:space="preserve">    # Gate 3: State</w:t>
+      </w:r>
+    </w:p>
+    <w:p>
+      <w:r>
+        <w:t xml:space="preserve">    if pending['status'] != 'pending':</w:t>
+      </w:r>
+    </w:p>
+    <w:p>
+      <w:r>
+        <w:t xml:space="preserve">        return 400  # Already resolved</w:t>
+      </w:r>
+    </w:p>
+    <w:p>
+      <w:r>
+        <w:t xml:space="preserve">    </w:t>
+      </w:r>
+    </w:p>
+    <w:p>
+      <w:r>
+        <w:t xml:space="preserve">    # All gates passed!</w:t>
+      </w:r>
+    </w:p>
+    <w:p>
+      <w:r>
+        <w:t xml:space="preserve">    execute(token)</w:t>
+      </w:r>
+    </w:p>
+    <w:p>
+      <w:r>
+        <w:t>Why?</w:t>
+      </w:r>
+    </w:p>
+    <w:p/>
+    <w:p>
+      <w:r>
+        <w:t>Defense in depth</w:t>
+      </w:r>
+    </w:p>
+    <w:p>
+      <w:r>
+        <w:t>Prevents token guessing (404)</w:t>
+      </w:r>
+    </w:p>
+    <w:p>
+      <w:r>
+        <w:t>Prevents cross-session attacks (403)</w:t>
+      </w:r>
+    </w:p>
+    <w:p>
+      <w:r>
+        <w:t>Prevents replay attacks (400)</w:t>
       </w:r>
     </w:p>
     <w:p/>
@@ -27313,6 +28670,7 @@
   <w:style w:type="character" w:default="1" w:styleId="DefaultParagraphFont">
     <w:name w:val="Default Paragraph Font"/>
     <w:uiPriority w:val="1"/>
+    <w:semiHidden/>
     <w:unhideWhenUsed/>
   </w:style>
   <w:style w:type="table" w:default="1" w:styleId="TableNormal">

</xml_diff>